<commit_message>
Ficha do colaborador: quadros de LOBs e Detalhe da LOB a 50%/50%
Co-Authored-By: Claude Sonnet 5 <noreply@anthropic.com>
Claude-Session: https://claude.ai/code/session_019jF459S2ehSho3txqSUTg1
</commit_message>
<xml_diff>
--- a/gap-analysis-competencias/docs/DOCUMENTO_TECNICO.docx
+++ b/gap-analysis-competencias/docs/DOCUMENTO_TECNICO.docx
@@ -4044,33 +4044,33 @@
         <w:t xml:space="preserve">Ficha do colaborador</w:t>
       </w:r>
       <w:r>
-        <w:t xml:space="preserve">: o quadro de LOBs (estreito, só nome+%) fica lado a lado com o Detalhe</w:t>
-      </w:r>
-    </w:p>
-    <w:p>
-      <w:pPr>
-        <w:spacing w:after="140"/>
-      </w:pPr>
-      <w:r>
-        <w:t xml:space="preserve">  da LOB selecionada (</w:t>
-      </w:r>
-      <w:r>
-        <w:rPr>
-          <w:rFonts w:ascii="Consolas" w:cs="Consolas" w:eastAsia="Consolas" w:hAnsi="Consolas"/>
-          <w:color w:val="A6274F"/>
-        </w:rPr>
-        <w:t xml:space="preserve">grid-cols-[320px_1fr]</w:t>
-      </w:r>
-      <w:r>
-        <w:t xml:space="preserve"> em ecrãs largos); por omissão mostra só as LOBs da</w:t>
-      </w:r>
-    </w:p>
-    <w:p>
-      <w:pPr>
-        <w:spacing w:after="140"/>
-      </w:pPr>
-      <w:r>
-        <w:t xml:space="preserve">  área do colaborador, com um seletor para ver todas.</w:t>
+        <w:t xml:space="preserve">: o quadro de LOBs (simplificado, só nome+%) fica lado a lado com o</w:t>
+      </w:r>
+    </w:p>
+    <w:p>
+      <w:pPr>
+        <w:spacing w:after="140"/>
+      </w:pPr>
+      <w:r>
+        <w:t xml:space="preserve">  Detalhe da LOB selecionada, cada um a 50% da largura (</w:t>
+      </w:r>
+      <w:r>
+        <w:rPr>
+          <w:rFonts w:ascii="Consolas" w:cs="Consolas" w:eastAsia="Consolas" w:hAnsi="Consolas"/>
+          <w:color w:val="A6274F"/>
+        </w:rPr>
+        <w:t xml:space="preserve">grid-cols-2</w:t>
+      </w:r>
+      <w:r>
+        <w:t xml:space="preserve"> em ecrãs largos); por</w:t>
+      </w:r>
+    </w:p>
+    <w:p>
+      <w:pPr>
+        <w:spacing w:after="140"/>
+      </w:pPr>
+      <w:r>
+        <w:t xml:space="preserve">  omissão mostra só as LOBs da área do colaborador, com um seletor para ver todas.</w:t>
       </w:r>
     </w:p>
     <w:p>

</xml_diff>